<commit_message>
fix: update support email to CONSORTIO@traininghungary.com
Changed all occurrences of Support@traininghungary.com to
CONSORTIO@traininghungary.com across the app and user guide.

https://claude.ai/code/session_01E37c9Pps6JjUr6bw4Vee92
</commit_message>
<xml_diff>
--- a/public/CONSORTIO_Felhasznaloi_Kezikonyv.docx
+++ b/public/CONSORTIO_Felhasznaloi_Kezikonyv.docx
@@ -1081,7 +1081,7 @@
           <w:sz w:val="21"/>
           <w:szCs w:val="21"/>
         </w:rPr>
-        <w:t xml:space="preserve">  [!] Figyelem: A felhasználói fiókokat az adminisztrátor hozza létre. Ha még nincs fiókja, kérje a rendszergazdát vagy írjon a support@traininghungary.com címre.</w:t>
+        <w:t xml:space="preserve">  [!] Figyelem: A felhasználói fiókokat az adminisztrátor hozza létre. Ha még nincs fiókja, kérje a rendszergazdát vagy írjon a CONSORTIO@traininghungary.com címre.</w:t>
       </w:r>
     </w:p>
     <w:p>
@@ -5009,7 +5009,7 @@
           <w:sz w:val="21"/>
           <w:szCs w:val="21"/>
         </w:rPr>
-        <w:t xml:space="preserve">Írjon a support@traininghungary.com címre az alábbi adatokkal:</w:t>
+        <w:t xml:space="preserve">Írjon a CONSORTIO@traininghungary.com címre az alábbi adatokkal:</w:t>
       </w:r>
     </w:p>
     <w:p>
@@ -5152,7 +5152,7 @@
           <w:sz w:val="21"/>
           <w:szCs w:val="21"/>
         </w:rPr>
-        <w:t xml:space="preserve">Írjon a support@traininghungary.com címre, és az adminisztrátor új jelszót állít be Önnek.</w:t>
+        <w:t xml:space="preserve">Írjon a CONSORTIO@traininghungary.com címre, és az adminisztrátor új jelszót állít be Önnek.</w:t>
       </w:r>
     </w:p>
     <w:p>
@@ -6016,7 +6016,7 @@
                 <w:sz w:val="19"/>
                 <w:szCs w:val="19"/>
               </w:rPr>
-              <w:t xml:space="preserve">support@traininghungary.com</w:t>
+              <w:t xml:space="preserve">CONSORTIO@traininghungary.com</w:t>
             </w:r>
           </w:p>
         </w:tc>

</xml_diff>